<commit_message>
Add .gitignore and quote < on md
</commit_message>
<xml_diff>
--- a/docs/proposta_pulizia_libreria_cassaforte.docx
+++ b/docs/proposta_pulizia_libreria_cassaforte.docx
@@ -528,13 +528,7 @@
         <w:pStyle w:val="FirstParagraph"/>
       </w:pPr>
       <w:r>
-        <w:t xml:space="preserve">groovyz PuliziaCassaforte.groovy</w:t>
-      </w:r>
-      <w:r>
-        <w:t xml:space="preserve"> </w:t>
-      </w:r>
-      <w:r>
-        <w:t xml:space="preserve"> </w:t>
+        <w:t xml:space="preserve">groovyz PuliziaCassaforte.groovy &lt;file-lista&gt; &lt;environment&gt;</w:t>
       </w:r>
     </w:p>
     <w:p>
@@ -546,16 +540,7 @@
         </w:numPr>
       </w:pPr>
       <w:r>
-        <w:t xml:space="preserve">file-lista:</w:t>
-      </w:r>
-      <w:r>
-        <w:t xml:space="preserve"> </w:t>
-      </w:r>
-      <w:r>
-        <w:t xml:space="preserve">,</w:t>
-      </w:r>
-      <w:r>
-        <w:t xml:space="preserve">, una per riga dove AZIONE:</w:t>
+        <w:t xml:space="preserve">file-lista: &lt;AZIONE&gt;,&lt;PATH_COMPLETO&gt;, una per riga dove AZIONE:</w:t>
       </w:r>
     </w:p>
     <w:p>

</xml_diff>